<commit_message>
Add evidence reference line at the end of each testing step
Co-Authored-By: Claude Opus 5.5 <noreply@anthropic.com>
Claude-Session: https://claude.ai/code/session_013DCsam75o7HfxUd48bU6NV
</commit_message>
<xml_diff>
--- a/BSI.IT.23.C1_Business_Requirement_Testing_Procedures.docx
+++ b/BSI.IT.23.C1_Business_Requirement_Testing_Procedures.docx
@@ -547,7 +547,7 @@
     </w:p>
     <w:p>
       <w:pPr>
-        <w:spacing w:after="200" w:before="80"/>
+        <w:spacing w:after="60" w:before="80"/>
       </w:pPr>
       <w:r>
         <w:rPr>
@@ -576,6 +576,29 @@
           <w:szCs w:val="20"/>
         </w:rPr>
         <w:t xml:space="preserve">All evidence was obtained except the Gate 4 approvals for Security Lending and the earlier (phase 1) approval mentioned in the Security Lending Release 1 approval e-mail (Open Item OI-01).</w:t>
+      </w:r>
+    </w:p>
+    <w:p>
+      <w:pPr>
+        <w:spacing w:after="200"/>
+      </w:pPr>
+      <w:r>
+        <w:rPr>
+          <w:rFonts w:ascii="Times New Roman" w:cs="Times New Roman" w:eastAsia="Times New Roman" w:hAnsi="Times New Roman"/>
+          <w:b/>
+          <w:bCs/>
+          <w:sz w:val="20"/>
+          <w:szCs w:val="20"/>
+        </w:rPr>
+        <w:t xml:space="preserve">Reference: </w:t>
+      </w:r>
+      <w:r>
+        <w:rPr>
+          <w:rFonts w:ascii="Times New Roman" w:cs="Times New Roman" w:eastAsia="Times New Roman" w:hAnsi="Times New Roman"/>
+          <w:sz w:val="20"/>
+          <w:szCs w:val="20"/>
+        </w:rPr>
+        <w:t xml:space="preserve">BSI.IT.23.C1.01 – BSI.IT.23.C1.12</w:t>
       </w:r>
     </w:p>
     <w:p>
@@ -687,7 +710,7 @@
     </w:p>
     <w:p>
       <w:pPr>
-        <w:spacing w:after="200" w:before="80"/>
+        <w:spacing w:after="60" w:before="80"/>
       </w:pPr>
       <w:r>
         <w:rPr>
@@ -716,6 +739,29 @@
           <w:szCs w:val="20"/>
         </w:rPr>
         <w:t xml:space="preserve">The population is accurate. Completeness will be concluded once the production release list and the PMO explanation for projects 3512 and 3625 are received (Open Item OI-03).</w:t>
+      </w:r>
+    </w:p>
+    <w:p>
+      <w:pPr>
+        <w:spacing w:after="200"/>
+      </w:pPr>
+      <w:r>
+        <w:rPr>
+          <w:rFonts w:ascii="Times New Roman" w:cs="Times New Roman" w:eastAsia="Times New Roman" w:hAnsi="Times New Roman"/>
+          <w:b/>
+          <w:bCs/>
+          <w:sz w:val="20"/>
+          <w:szCs w:val="20"/>
+        </w:rPr>
+        <w:t xml:space="preserve">Reference: </w:t>
+      </w:r>
+      <w:r>
+        <w:rPr>
+          <w:rFonts w:ascii="Times New Roman" w:cs="Times New Roman" w:eastAsia="Times New Roman" w:hAnsi="Times New Roman"/>
+          <w:sz w:val="20"/>
+          <w:szCs w:val="20"/>
+        </w:rPr>
+        <w:t xml:space="preserve">BSI.IT.23.C1.02; ServiceNow release tickets (BSI.IT.23.C25 cross-reference)</w:t>
       </w:r>
     </w:p>
     <w:p>
@@ -1381,7 +1427,7 @@
     </w:tbl>
     <w:p>
       <w:pPr>
-        <w:spacing w:after="200" w:before="80"/>
+        <w:spacing w:after="60" w:before="80"/>
       </w:pPr>
       <w:r>
         <w:rPr>
@@ -1410,6 +1456,29 @@
           <w:szCs w:val="20"/>
         </w:rPr>
         <w:t xml:space="preserve">The sample covers all in-scope projects and releases in the review period.</w:t>
+      </w:r>
+    </w:p>
+    <w:p>
+      <w:pPr>
+        <w:spacing w:after="200"/>
+      </w:pPr>
+      <w:r>
+        <w:rPr>
+          <w:rFonts w:ascii="Times New Roman" w:cs="Times New Roman" w:eastAsia="Times New Roman" w:hAnsi="Times New Roman"/>
+          <w:b/>
+          <w:bCs/>
+          <w:sz w:val="20"/>
+          <w:szCs w:val="20"/>
+        </w:rPr>
+        <w:t xml:space="preserve">Reference: </w:t>
+      </w:r>
+      <w:r>
+        <w:rPr>
+          <w:rFonts w:ascii="Times New Roman" w:cs="Times New Roman" w:eastAsia="Times New Roman" w:hAnsi="Times New Roman"/>
+          <w:sz w:val="20"/>
+          <w:szCs w:val="20"/>
+        </w:rPr>
+        <w:t xml:space="preserve">BSI.IT.23.C1.01, BSI.IT.23.C1.02</w:t>
       </w:r>
     </w:p>
     <w:p>
@@ -2320,7 +2389,7 @@
     </w:tbl>
     <w:p>
       <w:pPr>
-        <w:spacing w:after="200" w:before="80"/>
+        <w:spacing w:after="60" w:before="80"/>
       </w:pPr>
       <w:r>
         <w:rPr>
@@ -2349,6 +2418,29 @@
           <w:szCs w:val="20"/>
         </w:rPr>
         <w:t xml:space="preserve">All four BRDs include functional and non-functional requirements. Both NDF BRDs were approved before Build. Approval before Build for Security Lending is pending (Open Item OI-01).</w:t>
+      </w:r>
+    </w:p>
+    <w:p>
+      <w:pPr>
+        <w:spacing w:after="200"/>
+      </w:pPr>
+      <w:r>
+        <w:rPr>
+          <w:rFonts w:ascii="Times New Roman" w:cs="Times New Roman" w:eastAsia="Times New Roman" w:hAnsi="Times New Roman"/>
+          <w:b/>
+          <w:bCs/>
+          <w:sz w:val="20"/>
+          <w:szCs w:val="20"/>
+        </w:rPr>
+        <w:t xml:space="preserve">Reference: </w:t>
+      </w:r>
+      <w:r>
+        <w:rPr>
+          <w:rFonts w:ascii="Times New Roman" w:cs="Times New Roman" w:eastAsia="Times New Roman" w:hAnsi="Times New Roman"/>
+          <w:sz w:val="20"/>
+          <w:szCs w:val="20"/>
+        </w:rPr>
+        <w:t xml:space="preserve">BSI.IT.23.C1.03 – BSI.IT.23.C1.12; ServiceNow release tickets (BSI.IT.23.C25 cross-reference)</w:t>
       </w:r>
     </w:p>
     <w:p>
@@ -2466,7 +2558,7 @@
     </w:p>
     <w:p>
       <w:pPr>
-        <w:spacing w:after="200" w:before="80"/>
+        <w:spacing w:after="60" w:before="80"/>
       </w:pPr>
       <w:r>
         <w:rPr>
@@ -2495,6 +2587,29 @@
           <w:szCs w:val="20"/>
         </w:rPr>
         <w:t xml:space="preserve">Approvals were documented, given by the correct Business Sponsor and stored in Delivery Hub.</w:t>
+      </w:r>
+    </w:p>
+    <w:p>
+      <w:pPr>
+        <w:spacing w:after="200"/>
+      </w:pPr>
+      <w:r>
+        <w:rPr>
+          <w:rFonts w:ascii="Times New Roman" w:cs="Times New Roman" w:eastAsia="Times New Roman" w:hAnsi="Times New Roman"/>
+          <w:b/>
+          <w:bCs/>
+          <w:sz w:val="20"/>
+          <w:szCs w:val="20"/>
+        </w:rPr>
+        <w:t xml:space="preserve">Reference: </w:t>
+      </w:r>
+      <w:r>
+        <w:rPr>
+          <w:rFonts w:ascii="Times New Roman" w:cs="Times New Roman" w:eastAsia="Times New Roman" w:hAnsi="Times New Roman"/>
+          <w:sz w:val="20"/>
+          <w:szCs w:val="20"/>
+        </w:rPr>
+        <w:t xml:space="preserve">BSI.IT.23.C1.02, C1.03, C1.04, C1.05, C1.06, C1.07, C1.08, C1.09, C1.10, C1.11, C1.12</w:t>
       </w:r>
     </w:p>
     <w:p>
@@ -2576,7 +2691,7 @@
     </w:p>
     <w:p>
       <w:pPr>
-        <w:spacing w:after="200" w:before="80"/>
+        <w:spacing w:after="60" w:before="80"/>
       </w:pPr>
       <w:r>
         <w:rPr>
@@ -2605,6 +2720,29 @@
           <w:szCs w:val="20"/>
         </w:rPr>
         <w:t xml:space="preserve">If approval before Build cannot be evidenced for Security Lending Release 1, the sample will be concluded as a Fail and the control rating reassessed (Open Item OI-01).</w:t>
+      </w:r>
+    </w:p>
+    <w:p>
+      <w:pPr>
+        <w:spacing w:after="200"/>
+      </w:pPr>
+      <w:r>
+        <w:rPr>
+          <w:rFonts w:ascii="Times New Roman" w:cs="Times New Roman" w:eastAsia="Times New Roman" w:hAnsi="Times New Roman"/>
+          <w:b/>
+          <w:bCs/>
+          <w:sz w:val="20"/>
+          <w:szCs w:val="20"/>
+        </w:rPr>
+        <w:t xml:space="preserve">Reference: </w:t>
+      </w:r>
+      <w:r>
+        <w:rPr>
+          <w:rFonts w:ascii="Times New Roman" w:cs="Times New Roman" w:eastAsia="Times New Roman" w:hAnsi="Times New Roman"/>
+          <w:sz w:val="20"/>
+          <w:szCs w:val="20"/>
+        </w:rPr>
+        <w:t xml:space="preserve">BSI.IT.23.C1.03, BSI.IT.23.C1.04; release ticket RLSE1271544 (BSI.IT.23.C25.03)</w:t>
       </w:r>
     </w:p>
     <w:p>
@@ -2686,7 +2824,7 @@
     </w:p>
     <w:p>
       <w:pPr>
-        <w:spacing w:after="200" w:before="80"/>
+        <w:spacing w:after="60" w:before="80"/>
       </w:pPr>
       <w:r>
         <w:rPr>
@@ -2715,6 +2853,29 @@
           <w:szCs w:val="20"/>
         </w:rPr>
         <w:t xml:space="preserve">To be concluded once the PMO response is received.</w:t>
+      </w:r>
+    </w:p>
+    <w:p>
+      <w:pPr>
+        <w:spacing w:after="200"/>
+      </w:pPr>
+      <w:r>
+        <w:rPr>
+          <w:rFonts w:ascii="Times New Roman" w:cs="Times New Roman" w:eastAsia="Times New Roman" w:hAnsi="Times New Roman"/>
+          <w:b/>
+          <w:bCs/>
+          <w:sz w:val="20"/>
+          <w:szCs w:val="20"/>
+        </w:rPr>
+        <w:t xml:space="preserve">Reference: </w:t>
+      </w:r>
+      <w:r>
+        <w:rPr>
+          <w:rFonts w:ascii="Times New Roman" w:cs="Times New Roman" w:eastAsia="Times New Roman" w:hAnsi="Times New Roman"/>
+          <w:sz w:val="20"/>
+          <w:szCs w:val="20"/>
+        </w:rPr>
+        <w:t xml:space="preserve">BSI.IT.23.C1.01, BSI.IT.23.C1.04</w:t>
       </w:r>
     </w:p>
     <w:p>
@@ -2798,7 +2959,7 @@
     </w:p>
     <w:p>
       <w:pPr>
-        <w:spacing w:after="200" w:before="80"/>
+        <w:spacing w:after="60" w:before="80"/>
       </w:pPr>
       <w:r>
         <w:rPr>
@@ -2827,6 +2988,29 @@
           <w:szCs w:val="20"/>
         </w:rPr>
         <w:t xml:space="preserve">The control operates as designed for NDF; the Security Lending conclusion depends on Open Item OI-01.</w:t>
+      </w:r>
+    </w:p>
+    <w:p>
+      <w:pPr>
+        <w:spacing w:after="200"/>
+      </w:pPr>
+      <w:r>
+        <w:rPr>
+          <w:rFonts w:ascii="Times New Roman" w:cs="Times New Roman" w:eastAsia="Times New Roman" w:hAnsi="Times New Roman"/>
+          <w:b/>
+          <w:bCs/>
+          <w:sz w:val="20"/>
+          <w:szCs w:val="20"/>
+        </w:rPr>
+        <w:t xml:space="preserve">Reference: </w:t>
+      </w:r>
+      <w:r>
+        <w:rPr>
+          <w:rFonts w:ascii="Times New Roman" w:cs="Times New Roman" w:eastAsia="Times New Roman" w:hAnsi="Times New Roman"/>
+          <w:sz w:val="20"/>
+          <w:szCs w:val="20"/>
+        </w:rPr>
+        <w:t xml:space="preserve">BSI.IT.23.C1.03 – BSI.IT.23.C1.12</w:t>
       </w:r>
     </w:p>
     <w:p>
@@ -3027,7 +3211,7 @@
     </w:p>
     <w:p>
       <w:pPr>
-        <w:spacing w:after="200" w:before="80"/>
+        <w:spacing w:after="60" w:before="80"/>
       </w:pPr>
       <w:r>
         <w:rPr>
@@ -3060,6 +3244,29 @@
     </w:p>
     <w:p>
       <w:pPr>
+        <w:spacing w:after="200"/>
+      </w:pPr>
+      <w:r>
+        <w:rPr>
+          <w:rFonts w:ascii="Times New Roman" w:cs="Times New Roman" w:eastAsia="Times New Roman" w:hAnsi="Times New Roman"/>
+          <w:b/>
+          <w:bCs/>
+          <w:sz w:val="20"/>
+          <w:szCs w:val="20"/>
+        </w:rPr>
+        <w:t xml:space="preserve">Reference: </w:t>
+      </w:r>
+      <w:r>
+        <w:rPr>
+          <w:rFonts w:ascii="Times New Roman" w:cs="Times New Roman" w:eastAsia="Times New Roman" w:hAnsi="Times New Roman"/>
+          <w:sz w:val="20"/>
+          <w:szCs w:val="20"/>
+        </w:rPr>
+        <w:t xml:space="preserve">BSI.IT.23.C1.02 – BSI.IT.23.C1.12; Workpaper tab Control Performance Assessment</w:t>
+      </w:r>
+    </w:p>
+    <w:p>
+      <w:pPr>
         <w:spacing w:after="100" w:before="240"/>
       </w:pPr>
       <w:r>
@@ -3103,7 +3310,7 @@
     </w:p>
     <w:p>
       <w:pPr>
-        <w:spacing w:after="200" w:before="80"/>
+        <w:spacing w:after="60" w:before="80"/>
       </w:pPr>
       <w:r>
         <w:rPr>
@@ -3132,6 +3339,29 @@
           <w:szCs w:val="20"/>
         </w:rPr>
         <w:t xml:space="preserve">BRDs and approvals were kept for all releases; Gate 4 records for Security Lending are pending.</w:t>
+      </w:r>
+    </w:p>
+    <w:p>
+      <w:pPr>
+        <w:spacing w:after="200"/>
+      </w:pPr>
+      <w:r>
+        <w:rPr>
+          <w:rFonts w:ascii="Times New Roman" w:cs="Times New Roman" w:eastAsia="Times New Roman" w:hAnsi="Times New Roman"/>
+          <w:b/>
+          <w:bCs/>
+          <w:sz w:val="20"/>
+          <w:szCs w:val="20"/>
+        </w:rPr>
+        <w:t xml:space="preserve">Reference: </w:t>
+      </w:r>
+      <w:r>
+        <w:rPr>
+          <w:rFonts w:ascii="Times New Roman" w:cs="Times New Roman" w:eastAsia="Times New Roman" w:hAnsi="Times New Roman"/>
+          <w:sz w:val="20"/>
+          <w:szCs w:val="20"/>
+        </w:rPr>
+        <w:t xml:space="preserve">BSI.IT.23.C1.03, C1.05, C1.07, C1.09, C1.10, C1.12</w:t>
       </w:r>
     </w:p>
     <w:p>
@@ -3838,7 +4068,7 @@
             </w:tcMar>
           </w:tcPr>
           <w:p>
-            <w:hyperlink w:history="1" r:id="rIduskjthh2rx0bhvopluij7">
+            <w:hyperlink w:history="1" r:id="rIdybl1l_x5yy3xetdzaemq3">
               <w:r>
                 <w:rPr>
                   <w:rStyle w:val="Hyperlink"/>
@@ -3904,7 +4134,7 @@
             </w:tcMar>
           </w:tcPr>
           <w:p>
-            <w:hyperlink w:history="1" r:id="rIdwd_5kex9d7er_elzpxbg3">
+            <w:hyperlink w:history="1" r:id="rIdb3w9glzhtpmtogxqqxe6q">
               <w:r>
                 <w:rPr>
                   <w:rStyle w:val="Hyperlink"/>
@@ -3970,7 +4200,7 @@
             </w:tcMar>
           </w:tcPr>
           <w:p>
-            <w:hyperlink w:history="1" r:id="rIdcb9rudjb_wjgloesufck7">
+            <w:hyperlink w:history="1" r:id="rIdh14x5z4ysonr_odm0savj">
               <w:r>
                 <w:rPr>
                   <w:rStyle w:val="Hyperlink"/>
@@ -4036,7 +4266,7 @@
             </w:tcMar>
           </w:tcPr>
           <w:p>
-            <w:hyperlink w:history="1" r:id="rIdvbbf458mrvvxbif8y-_jp">
+            <w:hyperlink w:history="1" r:id="rIdsuovln9noih12nhyt9ghd">
               <w:r>
                 <w:rPr>
                   <w:rStyle w:val="Hyperlink"/>
@@ -4102,7 +4332,7 @@
             </w:tcMar>
           </w:tcPr>
           <w:p>
-            <w:hyperlink w:history="1" r:id="rIdgs3sbgkqpp_dwrwd4xlbp">
+            <w:hyperlink w:history="1" r:id="rIdkwye4abygv_s52runwg9a">
               <w:r>
                 <w:rPr>
                   <w:rStyle w:val="Hyperlink"/>
@@ -4168,7 +4398,7 @@
             </w:tcMar>
           </w:tcPr>
           <w:p>
-            <w:hyperlink w:history="1" r:id="rId63mhbjbd-0r4bivbgkr8n">
+            <w:hyperlink w:history="1" r:id="rIdtqwfhmoo0cx86htxiikyj">
               <w:r>
                 <w:rPr>
                   <w:rStyle w:val="Hyperlink"/>
@@ -4234,7 +4464,7 @@
             </w:tcMar>
           </w:tcPr>
           <w:p>
-            <w:hyperlink w:history="1" r:id="rId1tg3iw1vqem0ig0tynytz">
+            <w:hyperlink w:history="1" r:id="rId2bjpis9uvayi4ee-dsnpd">
               <w:r>
                 <w:rPr>
                   <w:rStyle w:val="Hyperlink"/>
@@ -4300,7 +4530,7 @@
             </w:tcMar>
           </w:tcPr>
           <w:p>
-            <w:hyperlink w:history="1" r:id="rIdpgqno7n6ev2nh5venzgmw">
+            <w:hyperlink w:history="1" r:id="rIdeh1dg92ijcvtb02rrmbnp">
               <w:r>
                 <w:rPr>
                   <w:rStyle w:val="Hyperlink"/>
@@ -4366,7 +4596,7 @@
             </w:tcMar>
           </w:tcPr>
           <w:p>
-            <w:hyperlink w:history="1" r:id="rIdmt1uigvmjx43g8u5wtj6w">
+            <w:hyperlink w:history="1" r:id="rId1swjakyko-spm6hv50yyf">
               <w:r>
                 <w:rPr>
                   <w:rStyle w:val="Hyperlink"/>
@@ -4432,7 +4662,7 @@
             </w:tcMar>
           </w:tcPr>
           <w:p>
-            <w:hyperlink w:history="1" r:id="rIdtsxl6p7leq9pp2dt0tvkq">
+            <w:hyperlink w:history="1" r:id="rIdifs4ra59lyonsk3hq5qzy">
               <w:r>
                 <w:rPr>
                   <w:rStyle w:val="Hyperlink"/>
@@ -4498,7 +4728,7 @@
             </w:tcMar>
           </w:tcPr>
           <w:p>
-            <w:hyperlink w:history="1" r:id="rIdcgfc_on5zdc5xz7o57a33">
+            <w:hyperlink w:history="1" r:id="rIdshn3i8i8vq0nzqj9u2nri">
               <w:r>
                 <w:rPr>
                   <w:rStyle w:val="Hyperlink"/>
@@ -4564,7 +4794,7 @@
             </w:tcMar>
           </w:tcPr>
           <w:p>
-            <w:hyperlink w:history="1" r:id="rId4b4ddar6vz87cuillwfxp">
+            <w:hyperlink w:history="1" r:id="rIdp0e-qf29gmayfsy4cjrma">
               <w:r>
                 <w:rPr>
                   <w:rStyle w:val="Hyperlink"/>
@@ -4630,7 +4860,7 @@
             </w:tcMar>
           </w:tcPr>
           <w:p>
-            <w:hyperlink w:history="1" r:id="rIddwxmxzq90ocy3sec8zlbq">
+            <w:hyperlink w:history="1" r:id="rIdbb-alqglej-mwtvqadmkt">
               <w:r>
                 <w:rPr>
                   <w:rStyle w:val="Hyperlink"/>

</xml_diff>